<commit_message>
Rename application branding to Workpulse
</commit_message>
<xml_diff>
--- a/Monitoring Doc/Business Requirements Document-1.docx
+++ b/Monitoring Doc/Business Requirements Document-1.docx
@@ -41,7 +41,7 @@
           <w:color w:val="6C757D"/>
           <w:sz w:val="20"/>
         </w:rPr>
-        <w:t>Project: iHRMS Monitor - Windows Desktop Monitoring Agent | Document Version: v1.0.1 | Platform: Windows 10/11 x64</w:t>
+        <w:t>Project: Workpulse - Windows Desktop Monitoring Agent | Document Version: v1.0.1 | Platform: Windows 10/11 x64</w:t>
       </w:r>
     </w:p>
     <w:p>
@@ -80,7 +80,7 @@
           <w:color w:val="212529"/>
           <w:sz w:val="20"/>
         </w:rPr>
-        <w:t>The iHRMS Monitor is an enterprise-grade Windows desktop monitoring agent seamlessly integrated with the centralized iHRMS platform. Built using Python and PySide6 (Qt6), the application provides organizations with transparent, automated visibility into employee desktop activity, application usage, active vs. idle distribution, and audit verification through periodic screenshots.</w:t>
+        <w:t>Workpulse is an enterprise-grade Windows desktop monitoring agent seamlessly integrated with the centralized iHRMS platform. Built using Python and PySide6 (Qt6), the application provides organizations with transparent, automated visibility into employee desktop activity, application usage, active vs. idle distribution, and audit verification through periodic screenshots.</w:t>
       </w:r>
     </w:p>
     <w:p>
@@ -93,7 +93,7 @@
           <w:color w:val="212529"/>
           <w:sz w:val="20"/>
         </w:rPr>
-        <w:t>The solution employs an offline-first architecture to guarantee 100% data integrity even during prolonged network outages. All tracking logs and screenshots are buffered locally in the current Windows user's writable AppData directory (%LOCALAPPDATA%\iHRMS Monitor\) and automatically synchronized with backend REST APIs once connectivity is restored, followed by strict server-confirmed local file cleanup.</w:t>
+        <w:t>The solution employs an offline-first architecture to guarantee 100% data integrity even during prolonged network outages. All tracking logs and screenshots are buffered locally in the current Windows user's writable AppData directory (%LOCALAPPDATA%\Workpulse\) and automatically synchronized with backend REST APIs once connectivity is restored, followed by strict server-confirmed local file cleanup.</w:t>
       </w:r>
     </w:p>
     <w:p>
@@ -134,7 +134,7 @@
           <w:color w:val="212529"/>
           <w:sz w:val="20"/>
         </w:rPr>
-        <w:t>The key business challenges solved by iHRMS Monitor include:</w:t>
+        <w:t>The key business challenges solved by Workpulse include:</w:t>
       </w:r>
     </w:p>
     <w:p>
@@ -1470,7 +1470,7 @@
                 <w:color w:val="212529"/>
                 <w:sz w:val="18"/>
               </w:rPr>
-              <w:t>Persist all logs in SQLite (%LOCALAPPDATA%\iHRMS Monitor\data\) with zero data loss.</w:t>
+              <w:t>Persist all logs in SQLite (%LOCALAPPDATA%\Workpulse\data\) with zero data loss.</w:t>
             </w:r>
           </w:p>
         </w:tc>

</xml_diff>

<commit_message>
Fix GitHub Actions workflow parsing and update project documentation
</commit_message>
<xml_diff>
--- a/Monitoring Doc/Business Requirements Document-1.docx
+++ b/Monitoring Doc/Business Requirements Document-1.docx
@@ -4,7 +4,7 @@
   <w:body>
     <w:p>
       <w:pPr>
-        <w:spacing w:after="40"/>
+        <w:spacing w:before="0" w:after="40"/>
       </w:pPr>
       <w:r>
         <w:rPr>
@@ -13,89 +13,86 @@
           <w:color w:val="0D9488"/>
           <w:sz w:val="20"/>
         </w:rPr>
-        <w:t>INDOVISION SERVICES</w:t>
+        <w:t>INDOVISION SERVICES PRIVATE LIMITED</w:t>
       </w:r>
     </w:p>
     <w:p>
       <w:pPr>
-        <w:spacing w:after="80"/>
+        <w:spacing w:before="0" w:after="80"/>
       </w:pPr>
       <w:r>
         <w:rPr>
           <w:rFonts w:ascii="Arial" w:hAnsi="Arial"/>
           <w:b/>
           <w:color w:val="0F2942"/>
-          <w:sz w:val="40"/>
+          <w:sz w:val="36"/>
         </w:rPr>
         <w:t>Business Requirements Document (BRD)</w:t>
       </w:r>
     </w:p>
     <w:p>
       <w:pPr>
-        <w:spacing w:after="280"/>
+        <w:spacing w:before="0" w:after="120"/>
       </w:pPr>
       <w:r>
         <w:rPr>
           <w:rFonts w:ascii="Arial" w:hAnsi="Arial"/>
-          <w:i/>
           <w:color w:val="64748B"/>
           <w:sz w:val="19"/>
         </w:rPr>
-        <w:t>Project: Workpulse | Application Version: 2.0.2 | Platforms: Windows 10/11 x64 &amp; macOS 12+ (Universal)</w:t>
+        <w:t>Project: iHRMS Desktop (Workpulse Client) | Application Version: 1.1 | Platforms: Windows 10/11 x64 &amp; macOS 11+ (Universal)</w:t>
       </w:r>
     </w:p>
     <w:p>
       <w:pPr>
-        <w:spacing w:after="280"/>
+        <w:spacing w:before="0" w:after="240"/>
       </w:pPr>
       <w:r>
         <w:rPr>
           <w:rFonts w:ascii="Arial" w:hAnsi="Arial"/>
-          <w:color w:val="0D9488"/>
-          <w:sz w:val="20"/>
+          <w:color w:val="CBD5E1"/>
+          <w:sz w:val="18"/>
         </w:rPr>
         <w:t>――――――――――――――――――――――――――――――――――――――――――――――――――――――――――</w:t>
       </w:r>
     </w:p>
     <w:p>
       <w:pPr>
-        <w:keepNext/>
-        <w:spacing w:before="280" w:after="120"/>
+        <w:spacing w:before="280" w:after="80"/>
       </w:pPr>
       <w:r>
         <w:rPr>
           <w:rFonts w:ascii="Arial" w:hAnsi="Arial"/>
           <w:b/>
           <w:color w:val="0F2942"/>
-          <w:sz w:val="28"/>
+          <w:sz w:val="24"/>
         </w:rPr>
         <w:t>1. Executive Summary</w:t>
       </w:r>
     </w:p>
     <w:p>
       <w:pPr>
-        <w:spacing w:after="120" w:line="276" w:lineRule="auto"/>
+        <w:spacing w:before="0" w:after="120" w:line="276" w:lineRule="auto"/>
       </w:pPr>
       <w:r>
         <w:rPr>
           <w:rFonts w:ascii="Arial" w:hAnsi="Arial"/>
-          <w:color w:val="2D3748"/>
-          <w:sz w:val="20"/>
+          <w:color w:val="334155"/>
+          <w:sz w:val="19"/>
         </w:rPr>
-        <w:t>Workpulse is an enterprise-grade desktop productivity monitoring, attendance verification, and timesheet management agent developed by Indovision Services. Built with Python 3.12 and PySide6, Workpulse provides a unified, cross-platform client for Windows 10/11 and macOS 12+ that operates unobtrusively to record application usage, monitor system health, synchronize attendance records, and support automated self-updating.</w:t>
+        <w:t>iHRMS Desktop is an enterprise-grade desktop productivity monitoring, attendance verification, and timesheet management agent developed by Indovision Services Private Limited. Featuring the native Workpulse activity monitoring engine, iHRMS Desktop provides a unified, cross-platform client for Windows 10/11 x64 and macOS 11+ (Universal Apple Silicon &amp; Intel) built on Python 3.12 and PySide6 (Qt 6.7+). The application operates unobtrusively to measure active window focus, detect smart idle durations, coordinate attendance punch times, manage Key Result Area (KRA) timesheets, buffer offline telemetry in an ACID SQLite database, and execute seamless background self-updating.</w:t>
       </w:r>
     </w:p>
     <w:p>
       <w:pPr>
-        <w:keepNext/>
-        <w:spacing w:before="280" w:after="120"/>
+        <w:spacing w:before="280" w:after="80"/>
       </w:pPr>
       <w:r>
         <w:rPr>
           <w:rFonts w:ascii="Arial" w:hAnsi="Arial"/>
           <w:b/>
           <w:color w:val="0F2942"/>
-          <w:sz w:val="28"/>
+          <w:sz w:val="24"/>
         </w:rPr>
         <w:t>2. Business Objectives &amp; Strategic Drivers</w:t>
       </w:r>
@@ -103,152 +100,174 @@
     <w:p>
       <w:pPr>
         <w:pStyle w:val="ListBullet"/>
-        <w:spacing w:after="60" w:line="276" w:lineRule="auto"/>
+        <w:spacing w:before="0" w:after="80" w:line="276" w:lineRule="auto"/>
       </w:pPr>
       <w:r>
         <w:rPr>
           <w:rFonts w:ascii="Arial" w:hAnsi="Arial"/>
           <w:b/>
           <w:color w:val="2D3748"/>
-          <w:sz w:val="20"/>
+          <w:sz w:val="19"/>
         </w:rPr>
         <w:t xml:space="preserve">Automated Productivity Tracking: </w:t>
       </w:r>
       <w:r>
         <w:rPr>
           <w:rFonts w:ascii="Arial" w:hAnsi="Arial"/>
-          <w:color w:val="2D3748"/>
-          <w:sz w:val="20"/>
+          <w:color w:val="334155"/>
+          <w:sz w:val="19"/>
         </w:rPr>
-        <w:t>Provide automated, tamper-resilient tracking of active applications, window titles, and exact focus durations across employee workstations.</w:t>
+        <w:t>Provide automated, tamper-resilient recording of active application executables, window titles, and focus durations across employee workstations.</w:t>
       </w:r>
     </w:p>
     <w:p>
       <w:pPr>
         <w:pStyle w:val="ListBullet"/>
-        <w:spacing w:after="60" w:line="276" w:lineRule="auto"/>
+        <w:spacing w:before="0" w:after="80" w:line="276" w:lineRule="auto"/>
       </w:pPr>
       <w:r>
         <w:rPr>
           <w:rFonts w:ascii="Arial" w:hAnsi="Arial"/>
           <w:b/>
           <w:color w:val="2D3748"/>
-          <w:sz w:val="20"/>
+          <w:sz w:val="19"/>
         </w:rPr>
         <w:t xml:space="preserve">Smart Inactivity Detection: </w:t>
       </w:r>
       <w:r>
         <w:rPr>
           <w:rFonts w:ascii="Arial" w:hAnsi="Arial"/>
-          <w:color w:val="2D3748"/>
-          <w:sz w:val="20"/>
+          <w:color w:val="334155"/>
+          <w:sz w:val="19"/>
         </w:rPr>
-        <w:t>Distinguish genuine active work from idle periods using hardware input event timers without invasive surveillance.</w:t>
+        <w:t>Accurately distinguish genuine active work from idle periods using hardware input event timers (Win32 GetLastInputInfo on Windows / CGEventSourceSecondsSinceLastEventType on macOS) without invasive surveillance.</w:t>
       </w:r>
     </w:p>
     <w:p>
       <w:pPr>
         <w:pStyle w:val="ListBullet"/>
-        <w:spacing w:after="60" w:line="276" w:lineRule="auto"/>
+        <w:spacing w:before="0" w:after="80" w:line="276" w:lineRule="auto"/>
       </w:pPr>
       <w:r>
         <w:rPr>
           <w:rFonts w:ascii="Arial" w:hAnsi="Arial"/>
           <w:b/>
           <w:color w:val="2D3748"/>
-          <w:sz w:val="20"/>
+          <w:sz w:val="19"/>
         </w:rPr>
-        <w:t xml:space="preserve">Unified HRMS Synchronization: </w:t>
+        <w:t xml:space="preserve">Unified Attendance &amp; HRMS Synchronization: </w:t>
       </w:r>
       <w:r>
         <w:rPr>
           <w:rFonts w:ascii="Arial" w:hAnsi="Arial"/>
-          <w:color w:val="2D3748"/>
-          <w:sz w:val="20"/>
+          <w:color w:val="334155"/>
+          <w:sz w:val="19"/>
         </w:rPr>
-        <w:t>Eliminate attendance discrepancies by synchronizing biometric punch timestamps and monthly calendar statuses directly into the desktop dashboard.</w:t>
+        <w:t>Eliminate attendance discrepancies by synchronizing biometric punch timestamps, monthly attendance calendars, and distinct green Missed Punch indicators directly into the desktop dashboard.</w:t>
       </w:r>
     </w:p>
     <w:p>
       <w:pPr>
         <w:pStyle w:val="ListBullet"/>
-        <w:spacing w:after="60" w:line="276" w:lineRule="auto"/>
+        <w:spacing w:before="0" w:after="80" w:line="276" w:lineRule="auto"/>
       </w:pPr>
       <w:r>
         <w:rPr>
           <w:rFonts w:ascii="Arial" w:hAnsi="Arial"/>
           <w:b/>
           <w:color w:val="2D3748"/>
-          <w:sz w:val="20"/>
+          <w:sz w:val="19"/>
         </w:rPr>
         <w:t xml:space="preserve">Streamlined Timesheet PMS: </w:t>
       </w:r>
       <w:r>
         <w:rPr>
           <w:rFonts w:ascii="Arial" w:hAnsi="Arial"/>
-          <w:color w:val="2D3748"/>
-          <w:sz w:val="20"/>
+          <w:color w:val="334155"/>
+          <w:sz w:val="19"/>
         </w:rPr>
-        <w:t>Enable employees to review daily Key Result Areas (KRAs), log task completion remarks, and submit timesheets directly from the desktop client.</w:t>
+        <w:t>Enable employees to review daily Key Result Areas (KRAs), log task completion remarks, save drafts, and submit timesheets and additional tasks directly from the desktop client.</w:t>
       </w:r>
     </w:p>
     <w:p>
       <w:pPr>
         <w:pStyle w:val="ListBullet"/>
-        <w:spacing w:after="60" w:line="276" w:lineRule="auto"/>
+        <w:spacing w:before="0" w:after="80" w:line="276" w:lineRule="auto"/>
       </w:pPr>
       <w:r>
         <w:rPr>
           <w:rFonts w:ascii="Arial" w:hAnsi="Arial"/>
           <w:b/>
           <w:color w:val="2D3748"/>
-          <w:sz w:val="20"/>
+          <w:sz w:val="19"/>
         </w:rPr>
-        <w:t xml:space="preserve">Local-First Resilience: </w:t>
+        <w:t xml:space="preserve">Local-First Resilience &amp; Verified Cleanup: </w:t>
       </w:r>
       <w:r>
         <w:rPr>
           <w:rFonts w:ascii="Arial" w:hAnsi="Arial"/>
-          <w:color w:val="2D3748"/>
-          <w:sz w:val="20"/>
+          <w:color w:val="334155"/>
+          <w:sz w:val="19"/>
         </w:rPr>
-        <w:t>Maintain full functionality and data buffering during network outages with zero data loss upon reconnection.</w:t>
+        <w:t>Maintain full offline functionality during network outages via local SQLite storage with Write-Ahead Logging (WAL); purge local screenshot files only upon HTTP 200 server confirmation.</w:t>
       </w:r>
     </w:p>
     <w:p>
       <w:pPr>
         <w:pStyle w:val="ListBullet"/>
-        <w:spacing w:after="60" w:line="276" w:lineRule="auto"/>
+        <w:spacing w:before="0" w:after="80" w:line="276" w:lineRule="auto"/>
       </w:pPr>
       <w:r>
         <w:rPr>
           <w:rFonts w:ascii="Arial" w:hAnsi="Arial"/>
           <w:b/>
           <w:color w:val="2D3748"/>
-          <w:sz w:val="20"/>
+          <w:sz w:val="19"/>
         </w:rPr>
-        <w:t xml:space="preserve">Autonomous Maintenance: </w:t>
+        <w:t xml:space="preserve">Autonomous Maintenance &amp; Crash Recovery: </w:t>
       </w:r>
       <w:r>
         <w:rPr>
           <w:rFonts w:ascii="Arial" w:hAnsi="Arial"/>
-          <w:color w:val="2D3748"/>
-          <w:sz w:val="20"/>
+          <w:color w:val="334155"/>
+          <w:sz w:val="19"/>
         </w:rPr>
-        <w:t>Ensure fleet-wide application consistency through silent, zero-touch auto-updates driven strictly by the backend API.</w:t>
+        <w:t>Ensure fleet-wide stability via silent auto-updates derived from App Controller API, transparent Windows watchdog supervision (iHRMS-Supervisor.exe + Task Scheduler), and native macOS launchd LaunchAgent recovery (KeepAlive).</w:t>
       </w:r>
     </w:p>
     <w:p>
       <w:pPr>
-        <w:keepNext/>
-        <w:spacing w:before="280" w:after="120"/>
+        <w:pStyle w:val="ListBullet"/>
+        <w:spacing w:before="0" w:after="80" w:line="276" w:lineRule="auto"/>
+      </w:pPr>
+      <w:r>
+        <w:rPr>
+          <w:rFonts w:ascii="Arial" w:hAnsi="Arial"/>
+          <w:b/>
+          <w:color w:val="2D3748"/>
+          <w:sz w:val="19"/>
+        </w:rPr>
+        <w:t xml:space="preserve">Hardware-Bound Session Security: </w:t>
+      </w:r>
+      <w:r>
+        <w:rPr>
+          <w:rFonts w:ascii="Arial" w:hAnsi="Arial"/>
+          <w:color w:val="334155"/>
+          <w:sz w:val="19"/>
+        </w:rPr>
+        <w:t>Persist authenticated sessions across ordinary restarts via Windows Credential Manager DPAPI and Apple macOS Keychain without repeated credential prompts.</w:t>
+      </w:r>
+    </w:p>
+    <w:p>
+      <w:pPr>
+        <w:spacing w:before="280" w:after="80"/>
       </w:pPr>
       <w:r>
         <w:rPr>
           <w:rFonts w:ascii="Arial" w:hAnsi="Arial"/>
           <w:b/>
           <w:color w:val="0F2942"/>
-          <w:sz w:val="28"/>
+          <w:sz w:val="24"/>
         </w:rPr>
         <w:t>3. Stakeholder Roles &amp; User Personas</w:t>
       </w:r>
@@ -259,27 +278,35 @@
         <w:jc w:val="center"/>
         <w:tblLayout w:type="fixed"/>
         <w:tblLook w:firstColumn="1" w:firstRow="1" w:lastColumn="0" w:lastRow="0" w:noHBand="0" w:noVBand="1" w:val="04A0"/>
+        <w:tblBorders>
+          <w:top w:val="single" w:sz="4" w:space="0" w:color="E2E8F0"/>
+          <w:left w:val="none"/>
+          <w:bottom w:val="single" w:sz="6" w:space="0" w:color="E2E8F0"/>
+          <w:right w:val="none"/>
+          <w:insideH w:val="single" w:sz="4" w:space="0" w:color="E2E8F0"/>
+          <w:insideV w:val="none"/>
+        </w:tblBorders>
       </w:tblPr>
       <w:tblGrid>
-        <w:gridCol w:w="3312"/>
-        <w:gridCol w:w="3312"/>
-        <w:gridCol w:w="3312"/>
+        <w:gridCol w:w="2880"/>
+        <w:gridCol w:w="2880"/>
+        <w:gridCol w:w="2880"/>
       </w:tblGrid>
       <w:tr>
         <w:tc>
           <w:tcPr>
-            <w:tcW w:type="dxa" w:w="2592"/>
+            <w:tcW w:type="dxa" w:w="2304"/>
             <w:shd w:fill="0F2942"/>
             <w:tcMar>
-              <w:top w:w="120" w:type="dxa"/>
-              <w:bottom w:w="120" w:type="dxa"/>
-              <w:left w:w="150" w:type="dxa"/>
-              <w:right w:w="150" w:type="dxa"/>
+              <w:top w:w="140" w:type="dxa"/>
+              <w:bottom w:w="140" w:type="dxa"/>
+              <w:left w:w="160" w:type="dxa"/>
+              <w:right w:w="160" w:type="dxa"/>
             </w:tcMar>
           </w:tcPr>
           <w:p>
             <w:pPr>
-              <w:jc w:val="left"/>
+              <w:spacing w:before="0" w:after="0"/>
             </w:pPr>
             <w:r>
               <w:rPr>
@@ -294,18 +321,18 @@
         </w:tc>
         <w:tc>
           <w:tcPr>
-            <w:tcW w:type="dxa" w:w="3600"/>
+            <w:tcW w:type="dxa" w:w="3456"/>
             <w:shd w:fill="0F2942"/>
             <w:tcMar>
-              <w:top w:w="120" w:type="dxa"/>
-              <w:bottom w:w="120" w:type="dxa"/>
-              <w:left w:w="150" w:type="dxa"/>
-              <w:right w:w="150" w:type="dxa"/>
+              <w:top w:w="140" w:type="dxa"/>
+              <w:bottom w:w="140" w:type="dxa"/>
+              <w:left w:w="160" w:type="dxa"/>
+              <w:right w:w="160" w:type="dxa"/>
             </w:tcMar>
           </w:tcPr>
           <w:p>
             <w:pPr>
-              <w:jc w:val="left"/>
+              <w:spacing w:before="0" w:after="0"/>
             </w:pPr>
             <w:r>
               <w:rPr>
@@ -323,15 +350,15 @@
             <w:tcW w:type="dxa" w:w="3600"/>
             <w:shd w:fill="0F2942"/>
             <w:tcMar>
-              <w:top w:w="120" w:type="dxa"/>
-              <w:bottom w:w="120" w:type="dxa"/>
-              <w:left w:w="150" w:type="dxa"/>
-              <w:right w:w="150" w:type="dxa"/>
+              <w:top w:w="140" w:type="dxa"/>
+              <w:bottom w:w="140" w:type="dxa"/>
+              <w:left w:w="160" w:type="dxa"/>
+              <w:right w:w="160" w:type="dxa"/>
             </w:tcMar>
           </w:tcPr>
           <w:p>
             <w:pPr>
-              <w:jc w:val="left"/>
+              <w:spacing w:before="0" w:after="0"/>
             </w:pPr>
             <w:r>
               <w:rPr>
@@ -348,18 +375,18 @@
       <w:tr>
         <w:tc>
           <w:tcPr>
-            <w:tcW w:type="dxa" w:w="2592"/>
+            <w:tcW w:type="dxa" w:w="2304"/>
             <w:shd w:fill="FFFFFF"/>
             <w:tcMar>
-              <w:top w:w="80" w:type="dxa"/>
-              <w:bottom w:w="80" w:type="dxa"/>
-              <w:left w:w="150" w:type="dxa"/>
-              <w:right w:w="150" w:type="dxa"/>
+              <w:top w:w="100" w:type="dxa"/>
+              <w:bottom w:w="100" w:type="dxa"/>
+              <w:left w:w="140" w:type="dxa"/>
+              <w:right w:w="140" w:type="dxa"/>
             </w:tcMar>
           </w:tcPr>
           <w:p>
             <w:pPr>
-              <w:jc w:val="left"/>
+              <w:spacing w:before="0" w:after="0" w:line="276" w:lineRule="auto"/>
             </w:pPr>
             <w:r>
               <w:rPr>
@@ -373,18 +400,18 @@
         </w:tc>
         <w:tc>
           <w:tcPr>
-            <w:tcW w:type="dxa" w:w="3600"/>
+            <w:tcW w:type="dxa" w:w="3456"/>
             <w:shd w:fill="FFFFFF"/>
             <w:tcMar>
-              <w:top w:w="80" w:type="dxa"/>
-              <w:bottom w:w="80" w:type="dxa"/>
-              <w:left w:w="150" w:type="dxa"/>
-              <w:right w:w="150" w:type="dxa"/>
+              <w:top w:w="100" w:type="dxa"/>
+              <w:bottom w:w="100" w:type="dxa"/>
+              <w:left w:w="140" w:type="dxa"/>
+              <w:right w:w="140" w:type="dxa"/>
             </w:tcMar>
           </w:tcPr>
           <w:p>
             <w:pPr>
-              <w:jc w:val="left"/>
+              <w:spacing w:before="0" w:after="0" w:line="276" w:lineRule="auto"/>
             </w:pPr>
             <w:r>
               <w:rPr>
@@ -392,7 +419,7 @@
                 <w:color w:val="2D3748"/>
                 <w:sz w:val="18"/>
               </w:rPr>
-              <w:t>Perform daily tasks, review logged time, check punch status, submit timesheets</w:t>
+              <w:t>Perform daily tasks, review logged focus time, verify punch status, submit KRA timesheets and additional tasks.</w:t>
             </w:r>
           </w:p>
         </w:tc>
@@ -401,15 +428,15 @@
             <w:tcW w:type="dxa" w:w="3600"/>
             <w:shd w:fill="FFFFFF"/>
             <w:tcMar>
-              <w:top w:w="80" w:type="dxa"/>
-              <w:bottom w:w="80" w:type="dxa"/>
-              <w:left w:w="150" w:type="dxa"/>
-              <w:right w:w="150" w:type="dxa"/>
+              <w:top w:w="100" w:type="dxa"/>
+              <w:bottom w:w="100" w:type="dxa"/>
+              <w:left w:w="140" w:type="dxa"/>
+              <w:right w:w="140" w:type="dxa"/>
             </w:tcMar>
           </w:tcPr>
           <w:p>
             <w:pPr>
-              <w:jc w:val="left"/>
+              <w:spacing w:before="0" w:after="0" w:line="276" w:lineRule="auto"/>
             </w:pPr>
             <w:r>
               <w:rPr>
@@ -417,7 +444,7 @@
                 <w:color w:val="2D3748"/>
                 <w:sz w:val="18"/>
               </w:rPr>
-              <w:t>Clean UI, transparent tracking status, accurate attendance display, seamless HRMS access</w:t>
+              <w:t>Clean UI, transparent tracking status, accurate attendance display, seamless HRMS Web Portal SSO access.</w:t>
             </w:r>
           </w:p>
         </w:tc>
@@ -425,18 +452,18 @@
       <w:tr>
         <w:tc>
           <w:tcPr>
-            <w:tcW w:type="dxa" w:w="2592"/>
+            <w:tcW w:type="dxa" w:w="2304"/>
             <w:shd w:fill="F8FAFC"/>
             <w:tcMar>
-              <w:top w:w="80" w:type="dxa"/>
-              <w:bottom w:w="80" w:type="dxa"/>
-              <w:left w:w="150" w:type="dxa"/>
-              <w:right w:w="150" w:type="dxa"/>
+              <w:top w:w="100" w:type="dxa"/>
+              <w:bottom w:w="100" w:type="dxa"/>
+              <w:left w:w="140" w:type="dxa"/>
+              <w:right w:w="140" w:type="dxa"/>
             </w:tcMar>
           </w:tcPr>
           <w:p>
             <w:pPr>
-              <w:jc w:val="left"/>
+              <w:spacing w:before="0" w:after="0" w:line="276" w:lineRule="auto"/>
             </w:pPr>
             <w:r>
               <w:rPr>
@@ -450,18 +477,18 @@
         </w:tc>
         <w:tc>
           <w:tcPr>
-            <w:tcW w:type="dxa" w:w="3600"/>
+            <w:tcW w:type="dxa" w:w="3456"/>
             <w:shd w:fill="F8FAFC"/>
             <w:tcMar>
-              <w:top w:w="80" w:type="dxa"/>
-              <w:bottom w:w="80" w:type="dxa"/>
-              <w:left w:w="150" w:type="dxa"/>
-              <w:right w:w="150" w:type="dxa"/>
+              <w:top w:w="100" w:type="dxa"/>
+              <w:bottom w:w="100" w:type="dxa"/>
+              <w:left w:w="140" w:type="dxa"/>
+              <w:right w:w="140" w:type="dxa"/>
             </w:tcMar>
           </w:tcPr>
           <w:p>
             <w:pPr>
-              <w:jc w:val="left"/>
+              <w:spacing w:before="0" w:after="0" w:line="276" w:lineRule="auto"/>
             </w:pPr>
             <w:r>
               <w:rPr>
@@ -469,7 +496,7 @@
                 <w:color w:val="2D3748"/>
                 <w:sz w:val="18"/>
               </w:rPr>
-              <w:t>Monitor workforce attendance, review KRA timesheets, approve leave quotas</w:t>
+              <w:t>Monitor workforce attendance compliance, review daily timesheet submissions, approve leave quotas.</w:t>
             </w:r>
           </w:p>
         </w:tc>
@@ -478,15 +505,15 @@
             <w:tcW w:type="dxa" w:w="3600"/>
             <w:shd w:fill="F8FAFC"/>
             <w:tcMar>
-              <w:top w:w="80" w:type="dxa"/>
-              <w:bottom w:w="80" w:type="dxa"/>
-              <w:left w:w="150" w:type="dxa"/>
-              <w:right w:w="150" w:type="dxa"/>
+              <w:top w:w="100" w:type="dxa"/>
+              <w:bottom w:w="100" w:type="dxa"/>
+              <w:left w:w="140" w:type="dxa"/>
+              <w:right w:w="140" w:type="dxa"/>
             </w:tcMar>
           </w:tcPr>
           <w:p>
             <w:pPr>
-              <w:jc w:val="left"/>
+              <w:spacing w:before="0" w:after="0" w:line="276" w:lineRule="auto"/>
             </w:pPr>
             <w:r>
               <w:rPr>
@@ -494,7 +521,7 @@
                 <w:color w:val="2D3748"/>
                 <w:sz w:val="18"/>
               </w:rPr>
-              <w:t>Accurate punch timestamps, verified activity batches, reliable leave balance visibility</w:t>
+              <w:t>Accurate punch timestamps, verified activity batches, reliable leave balance visibility, audit-ready data.</w:t>
             </w:r>
           </w:p>
         </w:tc>
@@ -502,18 +529,18 @@
       <w:tr>
         <w:tc>
           <w:tcPr>
-            <w:tcW w:type="dxa" w:w="2592"/>
+            <w:tcW w:type="dxa" w:w="2304"/>
             <w:shd w:fill="FFFFFF"/>
             <w:tcMar>
-              <w:top w:w="80" w:type="dxa"/>
-              <w:bottom w:w="80" w:type="dxa"/>
-              <w:left w:w="150" w:type="dxa"/>
-              <w:right w:w="150" w:type="dxa"/>
+              <w:top w:w="100" w:type="dxa"/>
+              <w:bottom w:w="100" w:type="dxa"/>
+              <w:left w:w="140" w:type="dxa"/>
+              <w:right w:w="140" w:type="dxa"/>
             </w:tcMar>
           </w:tcPr>
           <w:p>
             <w:pPr>
-              <w:jc w:val="left"/>
+              <w:spacing w:before="0" w:after="0" w:line="276" w:lineRule="auto"/>
             </w:pPr>
             <w:r>
               <w:rPr>
@@ -527,18 +554,18 @@
         </w:tc>
         <w:tc>
           <w:tcPr>
-            <w:tcW w:type="dxa" w:w="3600"/>
+            <w:tcW w:type="dxa" w:w="3456"/>
             <w:shd w:fill="FFFFFF"/>
             <w:tcMar>
-              <w:top w:w="80" w:type="dxa"/>
-              <w:bottom w:w="80" w:type="dxa"/>
-              <w:left w:w="150" w:type="dxa"/>
-              <w:right w:w="150" w:type="dxa"/>
+              <w:top w:w="100" w:type="dxa"/>
+              <w:bottom w:w="100" w:type="dxa"/>
+              <w:left w:w="140" w:type="dxa"/>
+              <w:right w:w="140" w:type="dxa"/>
             </w:tcMar>
           </w:tcPr>
           <w:p>
             <w:pPr>
-              <w:jc w:val="left"/>
+              <w:spacing w:before="0" w:after="0" w:line="276" w:lineRule="auto"/>
             </w:pPr>
             <w:r>
               <w:rPr>
@@ -546,7 +573,7 @@
                 <w:color w:val="2D3748"/>
                 <w:sz w:val="18"/>
               </w:rPr>
-              <w:t>Deploy and maintain client fleet, manage updates, ensure endpoint security</w:t>
+              <w:t>Deploy and maintain client fleet, manage silent updates, ensure endpoint security, audit process lifecycle.</w:t>
             </w:r>
           </w:p>
         </w:tc>
@@ -555,15 +582,15 @@
             <w:tcW w:type="dxa" w:w="3600"/>
             <w:shd w:fill="FFFFFF"/>
             <w:tcMar>
-              <w:top w:w="80" w:type="dxa"/>
-              <w:bottom w:w="80" w:type="dxa"/>
-              <w:left w:w="150" w:type="dxa"/>
-              <w:right w:w="150" w:type="dxa"/>
+              <w:top w:w="100" w:type="dxa"/>
+              <w:bottom w:w="100" w:type="dxa"/>
+              <w:left w:w="140" w:type="dxa"/>
+              <w:right w:w="140" w:type="dxa"/>
             </w:tcMar>
           </w:tcPr>
           <w:p>
             <w:pPr>
-              <w:jc w:val="left"/>
+              <w:spacing w:before="0" w:after="0" w:line="276" w:lineRule="auto"/>
             </w:pPr>
             <w:r>
               <w:rPr>
@@ -571,7 +598,7 @@
                 <w:color w:val="2D3748"/>
                 <w:sz w:val="18"/>
               </w:rPr>
-              <w:t>Silent Inno Setup / DMG deployment, low CPU/RAM overhead, secure TLS communication, auto-update loop prevention</w:t>
+              <w:t>Silent Inno Setup / DMG deployment, low CPU/RAM overhead (&lt;85 MB RAM, &lt;1% CPU), secure TLS 1.2+ communication, auto-update loop prevention.</w:t>
             </w:r>
           </w:p>
         </w:tc>
@@ -579,18 +606,18 @@
       <w:tr>
         <w:tc>
           <w:tcPr>
-            <w:tcW w:type="dxa" w:w="2592"/>
+            <w:tcW w:type="dxa" w:w="2304"/>
             <w:shd w:fill="F8FAFC"/>
             <w:tcMar>
-              <w:top w:w="80" w:type="dxa"/>
-              <w:bottom w:w="80" w:type="dxa"/>
-              <w:left w:w="150" w:type="dxa"/>
-              <w:right w:w="150" w:type="dxa"/>
+              <w:top w:w="100" w:type="dxa"/>
+              <w:bottom w:w="100" w:type="dxa"/>
+              <w:left w:w="140" w:type="dxa"/>
+              <w:right w:w="140" w:type="dxa"/>
             </w:tcMar>
           </w:tcPr>
           <w:p>
             <w:pPr>
-              <w:jc w:val="left"/>
+              <w:spacing w:before="0" w:after="0" w:line="276" w:lineRule="auto"/>
             </w:pPr>
             <w:r>
               <w:rPr>
@@ -604,18 +631,18 @@
         </w:tc>
         <w:tc>
           <w:tcPr>
-            <w:tcW w:type="dxa" w:w="3600"/>
+            <w:tcW w:type="dxa" w:w="3456"/>
             <w:shd w:fill="F8FAFC"/>
             <w:tcMar>
-              <w:top w:w="80" w:type="dxa"/>
-              <w:bottom w:w="80" w:type="dxa"/>
-              <w:left w:w="150" w:type="dxa"/>
-              <w:right w:w="150" w:type="dxa"/>
+              <w:top w:w="100" w:type="dxa"/>
+              <w:bottom w:w="100" w:type="dxa"/>
+              <w:left w:w="140" w:type="dxa"/>
+              <w:right w:w="140" w:type="dxa"/>
             </w:tcMar>
           </w:tcPr>
           <w:p>
             <w:pPr>
-              <w:jc w:val="left"/>
+              <w:spacing w:before="0" w:after="0" w:line="276" w:lineRule="auto"/>
             </w:pPr>
             <w:r>
               <w:rPr>
@@ -623,7 +650,7 @@
                 <w:color w:val="2D3748"/>
                 <w:sz w:val="18"/>
               </w:rPr>
-              <w:t>Analyze department productivity trends, system utilization, workforce performance</w:t>
+              <w:t>Analyze department productivity trends, system utilization, and workforce performance across remote/hybrid teams.</w:t>
             </w:r>
           </w:p>
         </w:tc>
@@ -632,15 +659,15 @@
             <w:tcW w:type="dxa" w:w="3600"/>
             <w:shd w:fill="F8FAFC"/>
             <w:tcMar>
-              <w:top w:w="80" w:type="dxa"/>
-              <w:bottom w:w="80" w:type="dxa"/>
-              <w:left w:w="150" w:type="dxa"/>
-              <w:right w:w="150" w:type="dxa"/>
+              <w:top w:w="100" w:type="dxa"/>
+              <w:bottom w:w="100" w:type="dxa"/>
+              <w:left w:w="140" w:type="dxa"/>
+              <w:right w:w="140" w:type="dxa"/>
             </w:tcMar>
           </w:tcPr>
           <w:p>
             <w:pPr>
-              <w:jc w:val="left"/>
+              <w:spacing w:before="0" w:after="0" w:line="276" w:lineRule="auto"/>
             </w:pPr>
             <w:r>
               <w:rPr>
@@ -648,7 +675,7 @@
                 <w:color w:val="2D3748"/>
                 <w:sz w:val="18"/>
               </w:rPr>
-              <w:t>Consolidated cloud analytics, high telemetry accuracy, audit-ready data retention</w:t>
+              <w:t>Consolidated cloud analytics, high telemetry accuracy, robust data retention, international privacy compliance.</w:t>
             </w:r>
           </w:p>
         </w:tc>
@@ -656,35 +683,33 @@
     </w:tbl>
     <w:p>
       <w:pPr>
-        <w:spacing w:after="160"/>
+        <w:spacing w:after="120"/>
       </w:pPr>
     </w:p>
     <w:p>
       <w:pPr>
-        <w:keepNext/>
-        <w:spacing w:before="280" w:after="120"/>
+        <w:spacing w:before="280" w:after="80"/>
       </w:pPr>
       <w:r>
         <w:rPr>
           <w:rFonts w:ascii="Arial" w:hAnsi="Arial"/>
           <w:b/>
           <w:color w:val="0F2942"/>
-          <w:sz w:val="28"/>
+          <w:sz w:val="24"/>
         </w:rPr>
         <w:t>4. Scope &amp; Feature Capabilities</w:t>
       </w:r>
     </w:p>
     <w:p>
       <w:pPr>
-        <w:keepNext/>
-        <w:spacing w:before="200" w:after="80"/>
+        <w:spacing w:before="200" w:after="60"/>
       </w:pPr>
       <w:r>
         <w:rPr>
           <w:rFonts w:ascii="Arial" w:hAnsi="Arial"/>
           <w:b/>
-          <w:color w:val="0D9488"/>
-          <w:sz w:val="23"/>
+          <w:color w:val="0F2942"/>
+          <w:sz w:val="21"/>
         </w:rPr>
         <w:t>4.1 Core In-Scope Capabilities</w:t>
       </w:r>
@@ -692,272 +717,339 @@
     <w:p>
       <w:pPr>
         <w:pStyle w:val="ListBullet"/>
-        <w:spacing w:after="60" w:line="276" w:lineRule="auto"/>
+        <w:spacing w:before="0" w:after="80" w:line="276" w:lineRule="auto"/>
       </w:pPr>
       <w:r>
         <w:rPr>
           <w:rFonts w:ascii="Arial" w:hAnsi="Arial"/>
           <w:b/>
           <w:color w:val="2D3748"/>
-          <w:sz w:val="20"/>
+          <w:sz w:val="19"/>
         </w:rPr>
         <w:t xml:space="preserve">Multi-Tenant Bootstrap: </w:t>
       </w:r>
       <w:r>
         <w:rPr>
           <w:rFonts w:ascii="Arial" w:hAnsi="Arial"/>
-          <w:color w:val="2D3748"/>
-          <w:sz w:val="20"/>
+          <w:color w:val="334155"/>
+          <w:sz w:val="19"/>
         </w:rPr>
-        <w:t>Dynamic company bootstrap and tenant configuration via AppController (/appcontroller/appcontroller).</w:t>
+        <w:t>Dynamic company verification and tenant configuration via App Controller (POST /appcontroller/appcontroller). Guarantees strictly empty form fields on fresh installation.</w:t>
       </w:r>
     </w:p>
     <w:p>
       <w:pPr>
         <w:pStyle w:val="ListBullet"/>
-        <w:spacing w:after="60" w:line="276" w:lineRule="auto"/>
+        <w:spacing w:before="0" w:after="80" w:line="276" w:lineRule="auto"/>
       </w:pPr>
       <w:r>
         <w:rPr>
           <w:rFonts w:ascii="Arial" w:hAnsi="Arial"/>
           <w:b/>
           <w:color w:val="2D3748"/>
-          <w:sz w:val="20"/>
+          <w:sz w:val="19"/>
         </w:rPr>
-        <w:t xml:space="preserve">Secure Authentication: </w:t>
+        <w:t xml:space="preserve">Two-Step Authentication &amp; Device Enrollment: </w:t>
       </w:r>
       <w:r>
         <w:rPr>
           <w:rFonts w:ascii="Arial" w:hAnsi="Arial"/>
-          <w:color w:val="2D3748"/>
-          <w:sz w:val="20"/>
+          <w:color w:val="334155"/>
+          <w:sz w:val="19"/>
         </w:rPr>
-        <w:t>Employee authentication with scoped device token binding (/tracking/enroll_device).</w:t>
+        <w:t>Company code verification checkmark and field lock, employee credential login (POST /login/login), and workstation enrollment (POST /workpulse/enroll_device).</w:t>
       </w:r>
     </w:p>
     <w:p>
       <w:pPr>
         <w:pStyle w:val="ListBullet"/>
-        <w:spacing w:after="60" w:line="276" w:lineRule="auto"/>
+        <w:spacing w:before="0" w:after="80" w:line="276" w:lineRule="auto"/>
       </w:pPr>
       <w:r>
         <w:rPr>
           <w:rFonts w:ascii="Arial" w:hAnsi="Arial"/>
           <w:b/>
           <w:color w:val="2D3748"/>
-          <w:sz w:val="20"/>
+          <w:sz w:val="19"/>
         </w:rPr>
-        <w:t xml:space="preserve">Activity State Engine: </w:t>
+        <w:t xml:space="preserve">Activity Focus State Engine: </w:t>
       </w:r>
       <w:r>
         <w:rPr>
           <w:rFonts w:ascii="Arial" w:hAnsi="Arial"/>
-          <w:color w:val="2D3748"/>
-          <w:sz w:val="20"/>
+          <w:color w:val="334155"/>
+          <w:sz w:val="19"/>
         </w:rPr>
-        <w:t>Active foreground window title and process ID monitoring with context-preserving idle detection.</w:t>
+        <w:t>Active foreground window title and process ID monitoring with context-preserving idle detection, 1000ms polling worker, and midnight active time auto-rollover.</w:t>
       </w:r>
     </w:p>
     <w:p>
       <w:pPr>
         <w:pStyle w:val="ListBullet"/>
-        <w:spacing w:after="60" w:line="276" w:lineRule="auto"/>
+        <w:spacing w:before="0" w:after="80" w:line="276" w:lineRule="auto"/>
       </w:pPr>
       <w:r>
         <w:rPr>
           <w:rFonts w:ascii="Arial" w:hAnsi="Arial"/>
           <w:b/>
           <w:color w:val="2D3748"/>
-          <w:sz w:val="20"/>
+          <w:sz w:val="19"/>
         </w:rPr>
-        <w:t xml:space="preserve">Batch Synchronization: </w:t>
+        <w:t xml:space="preserve">Transactional Batch Sync: </w:t>
       </w:r>
       <w:r>
         <w:rPr>
           <w:rFonts w:ascii="Arial" w:hAnsi="Arial"/>
-          <w:color w:val="2D3748"/>
-          <w:sz w:val="20"/>
+          <w:color w:val="334155"/>
+          <w:sz w:val="19"/>
         </w:rPr>
-        <w:t>Local ACID SQLite database storage with automatic transactional batch syncing (/tracking/save_activity_batch).</w:t>
+        <w:t>Local ACID SQLite database with automatic transactional batch syncing (POST /workpulse/save_activity_batch) uploading up to 100 records per batch.</w:t>
       </w:r>
     </w:p>
     <w:p>
       <w:pPr>
         <w:pStyle w:val="ListBullet"/>
-        <w:spacing w:after="60" w:line="276" w:lineRule="auto"/>
+        <w:spacing w:before="0" w:after="80" w:line="276" w:lineRule="auto"/>
       </w:pPr>
       <w:r>
         <w:rPr>
           <w:rFonts w:ascii="Arial" w:hAnsi="Arial"/>
           <w:b/>
           <w:color w:val="2D3748"/>
-          <w:sz w:val="20"/>
+          <w:sz w:val="19"/>
         </w:rPr>
         <w:t xml:space="preserve">Screenshot Management: </w:t>
       </w:r>
       <w:r>
         <w:rPr>
           <w:rFonts w:ascii="Arial" w:hAnsi="Arial"/>
-          <w:color w:val="2D3748"/>
-          <w:sz w:val="20"/>
+          <w:color w:val="334155"/>
+          <w:sz w:val="19"/>
         </w:rPr>
-        <w:t>Periodic JPEG desktop screen capture with offline queuing and macOS Screen Recording permission handling.</w:t>
+        <w:t>Periodic JPEG desktop screen capture (Quality 75) with offline queuing, upload via POST /workpulse/upload_screenshot, and macOS Screen Recording permission management.</w:t>
       </w:r>
     </w:p>
     <w:p>
       <w:pPr>
         <w:pStyle w:val="ListBullet"/>
-        <w:spacing w:after="60" w:line="276" w:lineRule="auto"/>
+        <w:spacing w:before="0" w:after="80" w:line="276" w:lineRule="auto"/>
       </w:pPr>
       <w:r>
         <w:rPr>
           <w:rFonts w:ascii="Arial" w:hAnsi="Arial"/>
           <w:b/>
           <w:color w:val="2D3748"/>
-          <w:sz w:val="20"/>
+          <w:sz w:val="19"/>
+        </w:rPr>
+        <w:t xml:space="preserve">Diagnostic Error Reporting: </w:t>
+      </w:r>
+      <w:r>
+        <w:rPr>
+          <w:rFonts w:ascii="Arial" w:hAnsi="Arial"/>
+          <w:color w:val="334155"/>
+          <w:sz w:val="19"/>
+        </w:rPr>
+        <w:t>Centralized error logging via POST /workpulse/report_error capturing unhandled exceptions across main and background threads.</w:t>
+      </w:r>
+    </w:p>
+    <w:p>
+      <w:pPr>
+        <w:pStyle w:val="ListBullet"/>
+        <w:spacing w:before="0" w:after="80" w:line="276" w:lineRule="auto"/>
+      </w:pPr>
+      <w:r>
+        <w:rPr>
+          <w:rFonts w:ascii="Arial" w:hAnsi="Arial"/>
+          <w:b/>
+          <w:color w:val="2D3748"/>
+          <w:sz w:val="19"/>
         </w:rPr>
         <w:t xml:space="preserve">System Health Telemetry: </w:t>
       </w:r>
       <w:r>
         <w:rPr>
           <w:rFonts w:ascii="Arial" w:hAnsi="Arial"/>
-          <w:color w:val="2D3748"/>
-          <w:sz w:val="20"/>
+          <w:color w:val="334155"/>
+          <w:sz w:val="19"/>
         </w:rPr>
-        <w:t>Continuous sampling of CPU, RAM, Disk, Battery, and Network metrics (/utils/system_health.py).</w:t>
+        <w:t>Continuous 60-second sampling of CPU, RAM, Disk, Battery, and Network metrics with integer-rounded payloads.</w:t>
       </w:r>
     </w:p>
     <w:p>
       <w:pPr>
         <w:pStyle w:val="ListBullet"/>
-        <w:spacing w:after="60" w:line="276" w:lineRule="auto"/>
+        <w:spacing w:before="0" w:after="80" w:line="276" w:lineRule="auto"/>
       </w:pPr>
       <w:r>
         <w:rPr>
           <w:rFonts w:ascii="Arial" w:hAnsi="Arial"/>
           <w:b/>
           <w:color w:val="2D3748"/>
-          <w:sz w:val="20"/>
+          <w:sz w:val="19"/>
         </w:rPr>
         <w:t xml:space="preserve">Attendance &amp; Leave Portal: </w:t>
       </w:r>
       <w:r>
         <w:rPr>
           <w:rFonts w:ascii="Arial" w:hAnsi="Arial"/>
-          <w:color w:val="2D3748"/>
-          <w:sz w:val="20"/>
+          <w:color w:val="334155"/>
+          <w:sz w:val="19"/>
         </w:rPr>
-        <w:t>Interactive attendance calendar, punch time card, and dynamic leave balance modal.</w:t>
+        <w:t>Interactive monthly attendance grid (POST /attendance/get_attendance_record), punch time card (POST /punch/get_punch_time), and dynamic leave quota modal (POST /LeaveApply/view_balance).</w:t>
       </w:r>
     </w:p>
     <w:p>
       <w:pPr>
         <w:pStyle w:val="ListBullet"/>
-        <w:spacing w:after="60" w:line="276" w:lineRule="auto"/>
+        <w:spacing w:before="0" w:after="80" w:line="276" w:lineRule="auto"/>
       </w:pPr>
       <w:r>
         <w:rPr>
           <w:rFonts w:ascii="Arial" w:hAnsi="Arial"/>
           <w:b/>
           <w:color w:val="2D3748"/>
-          <w:sz w:val="20"/>
+          <w:sz w:val="19"/>
         </w:rPr>
         <w:t xml:space="preserve">Task PMS &amp; Timesheets: </w:t>
       </w:r>
       <w:r>
         <w:rPr>
           <w:rFonts w:ascii="Arial" w:hAnsi="Arial"/>
-          <w:color w:val="2D3748"/>
-          <w:sz w:val="20"/>
+          <w:color w:val="334155"/>
+          <w:sz w:val="19"/>
         </w:rPr>
-        <w:t>Interactive KRA timesheet table with draft save and final submission (/TaskPMS/fill_time_sheet).</w:t>
+        <w:t>Interactive KRA timesheet table with draft save, additional task logging, and final submission (POST /TaskPMS/fill_time_sheet, POST /TaskPMS/save_additional_task).</w:t>
       </w:r>
     </w:p>
     <w:p>
       <w:pPr>
         <w:pStyle w:val="ListBullet"/>
-        <w:spacing w:after="60" w:line="276" w:lineRule="auto"/>
+        <w:spacing w:before="0" w:after="80" w:line="276" w:lineRule="auto"/>
       </w:pPr>
       <w:r>
         <w:rPr>
           <w:rFonts w:ascii="Arial" w:hAnsi="Arial"/>
           <w:b/>
           <w:color w:val="2D3748"/>
-          <w:sz w:val="20"/>
+          <w:sz w:val="19"/>
         </w:rPr>
         <w:t xml:space="preserve">HRMS Portal SSO: </w:t>
       </w:r>
       <w:r>
         <w:rPr>
           <w:rFonts w:ascii="Arial" w:hAnsi="Arial"/>
-          <w:color w:val="2D3748"/>
-          <w:sz w:val="20"/>
+          <w:color w:val="334155"/>
+          <w:sz w:val="19"/>
         </w:rPr>
-        <w:t>One-click single sign-on bridge launching the HRMS Web Portal with automated credential passing.</w:t>
+        <w:t>One-click single sign-on bridge launching the tenant HRMS Web Portal in default browser with ephemeral, secure credential passing.</w:t>
       </w:r>
     </w:p>
     <w:p>
       <w:pPr>
         <w:pStyle w:val="ListBullet"/>
-        <w:spacing w:after="60" w:line="276" w:lineRule="auto"/>
+        <w:spacing w:before="0" w:after="80" w:line="276" w:lineRule="auto"/>
       </w:pPr>
       <w:r>
         <w:rPr>
           <w:rFonts w:ascii="Arial" w:hAnsi="Arial"/>
           <w:b/>
           <w:color w:val="2D3748"/>
-          <w:sz w:val="20"/>
+          <w:sz w:val="19"/>
         </w:rPr>
         <w:t xml:space="preserve">Authoritative Auto-Updates: </w:t>
       </w:r>
       <w:r>
         <w:rPr>
           <w:rFonts w:ascii="Arial" w:hAnsi="Arial"/>
-          <w:color w:val="2D3748"/>
-          <w:sz w:val="20"/>
+          <w:color w:val="334155"/>
+          <w:sz w:val="19"/>
         </w:rPr>
-        <w:t>Semantic version checking (/punch/check_new_version) with silent Inno Setup installation and update loop guards.</w:t>
+        <w:t>Platform-specific version checking via App Controller (apps.WINDOWS / apps.MAC), binary validation (MZ/PE and DMG koly), detached silent execution, and 24h loop cooldown guard.</w:t>
       </w:r>
     </w:p>
     <w:p>
       <w:pPr>
-        <w:keepNext/>
-        <w:spacing w:before="200" w:after="80"/>
+        <w:pStyle w:val="ListBullet"/>
+        <w:spacing w:before="0" w:after="80" w:line="276" w:lineRule="auto"/>
       </w:pPr>
       <w:r>
         <w:rPr>
           <w:rFonts w:ascii="Arial" w:hAnsi="Arial"/>
           <w:b/>
-          <w:color w:val="0D9488"/>
-          <w:sz w:val="23"/>
+          <w:color w:val="2D3748"/>
+          <w:sz w:val="19"/>
+        </w:rPr>
+        <w:t xml:space="preserve">Process Termination &amp; Startup Recovery: </w:t>
+      </w:r>
+      <w:r>
+        <w:rPr>
+          <w:rFonts w:ascii="Arial" w:hAnsi="Arial"/>
+          <w:color w:val="334155"/>
+          <w:sz w:val="19"/>
+        </w:rPr>
+        <w:t>Windows detached supervisor (iHRMS-Supervisor.exe) and Task Scheduler watchdog; macOS launchd LaunchAgent with KeepAlive; single-instance lock clearance.</w:t>
+      </w:r>
+    </w:p>
+    <w:p>
+      <w:pPr>
+        <w:pStyle w:val="ListBullet"/>
+        <w:spacing w:before="0" w:after="80" w:line="276" w:lineRule="auto"/>
+      </w:pPr>
+      <w:r>
+        <w:rPr>
+          <w:rFonts w:ascii="Arial" w:hAnsi="Arial"/>
+          <w:b/>
+          <w:color w:val="2D3748"/>
+          <w:sz w:val="19"/>
+        </w:rPr>
+        <w:t xml:space="preserve">True Uninstallation Reporting: </w:t>
+      </w:r>
+      <w:r>
+        <w:rPr>
+          <w:rFonts w:ascii="Arial" w:hAnsi="Arial"/>
+          <w:color w:val="334155"/>
+          <w:sz w:val="19"/>
+        </w:rPr>
+        <w:t>Isolated uninstaller lifecycle detection (services/uninstall_reporter.py) with offline scheduled task delivery.</w:t>
+      </w:r>
+    </w:p>
+    <w:p>
+      <w:pPr>
+        <w:spacing w:before="200" w:after="60"/>
+      </w:pPr>
+      <w:r>
+        <w:rPr>
+          <w:rFonts w:ascii="Arial" w:hAnsi="Arial"/>
+          <w:b/>
+          <w:color w:val="0F2942"/>
+          <w:sz w:val="21"/>
         </w:rPr>
         <w:t>4.2 Out-of-Scope Capabilities (Privacy Safeguards)</w:t>
       </w:r>
     </w:p>
     <w:p>
       <w:pPr>
-        <w:spacing w:after="120" w:line="276" w:lineRule="auto"/>
+        <w:spacing w:before="0" w:after="120" w:line="276" w:lineRule="auto"/>
       </w:pPr>
       <w:r>
         <w:rPr>
           <w:rFonts w:ascii="Arial" w:hAnsi="Arial"/>
-          <w:color w:val="2D3748"/>
-          <w:sz w:val="20"/>
+          <w:color w:val="334155"/>
+          <w:sz w:val="19"/>
         </w:rPr>
-        <w:t>To ensure strict compliance with international privacy frameworks, Workpulse explicitly does NOT implement keystroke logging, clipboard inspection, browser history scraping, unauthorized webcam/audio recording, or background file tampering.</w:t>
+        <w:t>To ensure strict compliance with global privacy standards, iHRMS Desktop explicitly does NOT implement keystroke logging, clipboard inspection, browser history scraping, unauthorized webcam/audio recording, or arbitrary background file tampering.</w:t>
       </w:r>
     </w:p>
     <w:p>
       <w:pPr>
-        <w:keepNext/>
-        <w:spacing w:before="280" w:after="120"/>
+        <w:spacing w:before="280" w:after="80"/>
       </w:pPr>
       <w:r>
         <w:rPr>
           <w:rFonts w:ascii="Arial" w:hAnsi="Arial"/>
           <w:b/>
           <w:color w:val="0F2942"/>
-          <w:sz w:val="28"/>
+          <w:sz w:val="24"/>
         </w:rPr>
         <w:t>5. Business Constraints &amp; Acceptance Criteria</w:t>
       </w:r>
@@ -968,27 +1060,35 @@
         <w:jc w:val="center"/>
         <w:tblLayout w:type="fixed"/>
         <w:tblLook w:firstColumn="1" w:firstRow="1" w:lastColumn="0" w:lastRow="0" w:noHBand="0" w:noVBand="1" w:val="04A0"/>
+        <w:tblBorders>
+          <w:top w:val="single" w:sz="4" w:space="0" w:color="E2E8F0"/>
+          <w:left w:val="none"/>
+          <w:bottom w:val="single" w:sz="6" w:space="0" w:color="E2E8F0"/>
+          <w:right w:val="none"/>
+          <w:insideH w:val="single" w:sz="4" w:space="0" w:color="E2E8F0"/>
+          <w:insideV w:val="none"/>
+        </w:tblBorders>
       </w:tblPr>
       <w:tblGrid>
-        <w:gridCol w:w="3312"/>
-        <w:gridCol w:w="3312"/>
-        <w:gridCol w:w="3312"/>
+        <w:gridCol w:w="2880"/>
+        <w:gridCol w:w="2880"/>
+        <w:gridCol w:w="2880"/>
       </w:tblGrid>
       <w:tr>
         <w:tc>
           <w:tcPr>
-            <w:tcW w:type="dxa" w:w="1872"/>
+            <w:tcW w:type="dxa" w:w="2160"/>
             <w:shd w:fill="0F2942"/>
             <w:tcMar>
-              <w:top w:w="120" w:type="dxa"/>
-              <w:bottom w:w="120" w:type="dxa"/>
-              <w:left w:w="150" w:type="dxa"/>
-              <w:right w:w="150" w:type="dxa"/>
+              <w:top w:w="140" w:type="dxa"/>
+              <w:bottom w:w="140" w:type="dxa"/>
+              <w:left w:w="160" w:type="dxa"/>
+              <w:right w:w="160" w:type="dxa"/>
             </w:tcMar>
           </w:tcPr>
           <w:p>
             <w:pPr>
-              <w:jc w:val="left"/>
+              <w:spacing w:before="0" w:after="0"/>
             </w:pPr>
             <w:r>
               <w:rPr>
@@ -1006,15 +1106,15 @@
             <w:tcW w:type="dxa" w:w="4608"/>
             <w:shd w:fill="0F2942"/>
             <w:tcMar>
-              <w:top w:w="120" w:type="dxa"/>
-              <w:bottom w:w="120" w:type="dxa"/>
-              <w:left w:w="150" w:type="dxa"/>
-              <w:right w:w="150" w:type="dxa"/>
+              <w:top w:w="140" w:type="dxa"/>
+              <w:bottom w:w="140" w:type="dxa"/>
+              <w:left w:w="160" w:type="dxa"/>
+              <w:right w:w="160" w:type="dxa"/>
             </w:tcMar>
           </w:tcPr>
           <w:p>
             <w:pPr>
-              <w:jc w:val="left"/>
+              <w:spacing w:before="0" w:after="0"/>
             </w:pPr>
             <w:r>
               <w:rPr>
@@ -1029,18 +1129,18 @@
         </w:tc>
         <w:tc>
           <w:tcPr>
-            <w:tcW w:type="dxa" w:w="3312"/>
+            <w:tcW w:type="dxa" w:w="2592"/>
             <w:shd w:fill="0F2942"/>
             <w:tcMar>
-              <w:top w:w="120" w:type="dxa"/>
-              <w:bottom w:w="120" w:type="dxa"/>
-              <w:left w:w="150" w:type="dxa"/>
-              <w:right w:w="150" w:type="dxa"/>
+              <w:top w:w="140" w:type="dxa"/>
+              <w:bottom w:w="140" w:type="dxa"/>
+              <w:left w:w="160" w:type="dxa"/>
+              <w:right w:w="160" w:type="dxa"/>
             </w:tcMar>
           </w:tcPr>
           <w:p>
             <w:pPr>
-              <w:jc w:val="left"/>
+              <w:spacing w:before="0" w:after="0"/>
             </w:pPr>
             <w:r>
               <w:rPr>
@@ -1057,22 +1157,23 @@
       <w:tr>
         <w:tc>
           <w:tcPr>
-            <w:tcW w:type="dxa" w:w="1872"/>
+            <w:tcW w:type="dxa" w:w="2160"/>
             <w:shd w:fill="FFFFFF"/>
             <w:tcMar>
-              <w:top w:w="80" w:type="dxa"/>
-              <w:bottom w:w="80" w:type="dxa"/>
-              <w:left w:w="150" w:type="dxa"/>
-              <w:right w:w="150" w:type="dxa"/>
+              <w:top w:w="100" w:type="dxa"/>
+              <w:bottom w:w="100" w:type="dxa"/>
+              <w:left w:w="140" w:type="dxa"/>
+              <w:right w:w="140" w:type="dxa"/>
             </w:tcMar>
           </w:tcPr>
           <w:p>
             <w:pPr>
-              <w:jc w:val="left"/>
+              <w:spacing w:before="0" w:after="0" w:line="276" w:lineRule="auto"/>
             </w:pPr>
             <w:r>
               <w:rPr>
                 <w:rFonts w:ascii="Arial" w:hAnsi="Arial"/>
+                <w:b/>
                 <w:color w:val="2D3748"/>
                 <w:sz w:val="18"/>
               </w:rPr>
@@ -1085,15 +1186,15 @@
             <w:tcW w:type="dxa" w:w="4608"/>
             <w:shd w:fill="FFFFFF"/>
             <w:tcMar>
-              <w:top w:w="80" w:type="dxa"/>
-              <w:bottom w:w="80" w:type="dxa"/>
-              <w:left w:w="150" w:type="dxa"/>
-              <w:right w:w="150" w:type="dxa"/>
+              <w:top w:w="100" w:type="dxa"/>
+              <w:bottom w:w="100" w:type="dxa"/>
+              <w:left w:w="140" w:type="dxa"/>
+              <w:right w:w="140" w:type="dxa"/>
             </w:tcMar>
           </w:tcPr>
           <w:p>
             <w:pPr>
-              <w:jc w:val="left"/>
+              <w:spacing w:before="0" w:after="0" w:line="276" w:lineRule="auto"/>
             </w:pPr>
             <w:r>
               <w:rPr>
@@ -1101,24 +1202,24 @@
                 <w:color w:val="2D3748"/>
                 <w:sz w:val="18"/>
               </w:rPr>
-              <w:t>Memory footprint must remain under 85 MB RAM during steady-state tracking</w:t>
+              <w:t>Memory footprint must remain under 85 MB RAM and CPU usage &lt; 1.0% during steady-state tracking.</w:t>
             </w:r>
           </w:p>
         </w:tc>
         <w:tc>
           <w:tcPr>
-            <w:tcW w:type="dxa" w:w="3312"/>
+            <w:tcW w:type="dxa" w:w="2592"/>
             <w:shd w:fill="FFFFFF"/>
             <w:tcMar>
-              <w:top w:w="80" w:type="dxa"/>
-              <w:bottom w:w="80" w:type="dxa"/>
-              <w:left w:w="150" w:type="dxa"/>
-              <w:right w:w="150" w:type="dxa"/>
+              <w:top w:w="100" w:type="dxa"/>
+              <w:bottom w:w="100" w:type="dxa"/>
+              <w:left w:w="140" w:type="dxa"/>
+              <w:right w:w="140" w:type="dxa"/>
             </w:tcMar>
           </w:tcPr>
           <w:p>
             <w:pPr>
-              <w:jc w:val="left"/>
+              <w:spacing w:before="0" w:after="0" w:line="276" w:lineRule="auto"/>
             </w:pPr>
             <w:r>
               <w:rPr>
@@ -1126,7 +1227,7 @@
                 <w:color w:val="2D3748"/>
                 <w:sz w:val="18"/>
               </w:rPr>
-              <w:t>Process telemetry profiling on Windows and macOS runners</w:t>
+              <w:t>Process telemetry profiling on Windows and macOS benchmark runners.</w:t>
             </w:r>
           </w:p>
         </w:tc>
@@ -1134,22 +1235,23 @@
       <w:tr>
         <w:tc>
           <w:tcPr>
-            <w:tcW w:type="dxa" w:w="1872"/>
+            <w:tcW w:type="dxa" w:w="2160"/>
             <w:shd w:fill="F8FAFC"/>
             <w:tcMar>
-              <w:top w:w="80" w:type="dxa"/>
-              <w:bottom w:w="80" w:type="dxa"/>
-              <w:left w:w="150" w:type="dxa"/>
-              <w:right w:w="150" w:type="dxa"/>
+              <w:top w:w="100" w:type="dxa"/>
+              <w:bottom w:w="100" w:type="dxa"/>
+              <w:left w:w="140" w:type="dxa"/>
+              <w:right w:w="140" w:type="dxa"/>
             </w:tcMar>
           </w:tcPr>
           <w:p>
             <w:pPr>
-              <w:jc w:val="left"/>
+              <w:spacing w:before="0" w:after="0" w:line="276" w:lineRule="auto"/>
             </w:pPr>
             <w:r>
               <w:rPr>
                 <w:rFonts w:ascii="Arial" w:hAnsi="Arial"/>
+                <w:b/>
                 <w:color w:val="2D3748"/>
                 <w:sz w:val="18"/>
               </w:rPr>
@@ -1162,15 +1264,15 @@
             <w:tcW w:type="dxa" w:w="4608"/>
             <w:shd w:fill="F8FAFC"/>
             <w:tcMar>
-              <w:top w:w="80" w:type="dxa"/>
-              <w:bottom w:w="80" w:type="dxa"/>
-              <w:left w:w="150" w:type="dxa"/>
-              <w:right w:w="150" w:type="dxa"/>
+              <w:top w:w="100" w:type="dxa"/>
+              <w:bottom w:w="100" w:type="dxa"/>
+              <w:left w:w="140" w:type="dxa"/>
+              <w:right w:w="140" w:type="dxa"/>
             </w:tcMar>
           </w:tcPr>
           <w:p>
             <w:pPr>
-              <w:jc w:val="left"/>
+              <w:spacing w:before="0" w:after="0" w:line="276" w:lineRule="auto"/>
             </w:pPr>
             <w:r>
               <w:rPr>
@@ -1178,24 +1280,24 @@
                 <w:color w:val="2D3748"/>
                 <w:sz w:val="18"/>
               </w:rPr>
-              <w:t>Zero data loss during unexpected network disconnects or operating system restarts</w:t>
+              <w:t>Zero data loss during unexpected network disconnects, app crashes, or operating system restarts.</w:t>
             </w:r>
           </w:p>
         </w:tc>
         <w:tc>
           <w:tcPr>
-            <w:tcW w:type="dxa" w:w="3312"/>
+            <w:tcW w:type="dxa" w:w="2592"/>
             <w:shd w:fill="F8FAFC"/>
             <w:tcMar>
-              <w:top w:w="80" w:type="dxa"/>
-              <w:bottom w:w="80" w:type="dxa"/>
-              <w:left w:w="150" w:type="dxa"/>
-              <w:right w:w="150" w:type="dxa"/>
+              <w:top w:w="100" w:type="dxa"/>
+              <w:bottom w:w="100" w:type="dxa"/>
+              <w:left w:w="140" w:type="dxa"/>
+              <w:right w:w="140" w:type="dxa"/>
             </w:tcMar>
           </w:tcPr>
           <w:p>
             <w:pPr>
-              <w:jc w:val="left"/>
+              <w:spacing w:before="0" w:after="0" w:line="276" w:lineRule="auto"/>
             </w:pPr>
             <w:r>
               <w:rPr>
@@ -1203,7 +1305,7 @@
                 <w:color w:val="2D3748"/>
                 <w:sz w:val="18"/>
               </w:rPr>
-              <w:t>Local SQLite transaction rollback and automated offline queue sync tests</w:t>
+              <w:t>Local SQLite transaction rollback, WAL validation, and automated offline queue sync tests.</w:t>
             </w:r>
           </w:p>
         </w:tc>
@@ -1211,22 +1313,23 @@
       <w:tr>
         <w:tc>
           <w:tcPr>
-            <w:tcW w:type="dxa" w:w="1872"/>
+            <w:tcW w:type="dxa" w:w="2160"/>
             <w:shd w:fill="FFFFFF"/>
             <w:tcMar>
-              <w:top w:w="80" w:type="dxa"/>
-              <w:bottom w:w="80" w:type="dxa"/>
-              <w:left w:w="150" w:type="dxa"/>
-              <w:right w:w="150" w:type="dxa"/>
+              <w:top w:w="100" w:type="dxa"/>
+              <w:bottom w:w="100" w:type="dxa"/>
+              <w:left w:w="140" w:type="dxa"/>
+              <w:right w:w="140" w:type="dxa"/>
             </w:tcMar>
           </w:tcPr>
           <w:p>
             <w:pPr>
-              <w:jc w:val="left"/>
+              <w:spacing w:before="0" w:after="0" w:line="276" w:lineRule="auto"/>
             </w:pPr>
             <w:r>
               <w:rPr>
                 <w:rFonts w:ascii="Arial" w:hAnsi="Arial"/>
+                <w:b/>
                 <w:color w:val="2D3748"/>
                 <w:sz w:val="18"/>
               </w:rPr>
@@ -1239,15 +1342,15 @@
             <w:tcW w:type="dxa" w:w="4608"/>
             <w:shd w:fill="FFFFFF"/>
             <w:tcMar>
-              <w:top w:w="80" w:type="dxa"/>
-              <w:bottom w:w="80" w:type="dxa"/>
-              <w:left w:w="150" w:type="dxa"/>
-              <w:right w:w="150" w:type="dxa"/>
+              <w:top w:w="100" w:type="dxa"/>
+              <w:bottom w:w="100" w:type="dxa"/>
+              <w:left w:w="140" w:type="dxa"/>
+              <w:right w:w="140" w:type="dxa"/>
             </w:tcMar>
           </w:tcPr>
           <w:p>
             <w:pPr>
-              <w:jc w:val="left"/>
+              <w:spacing w:before="0" w:after="0" w:line="276" w:lineRule="auto"/>
             </w:pPr>
             <w:r>
               <w:rPr>
@@ -1255,24 +1358,24 @@
                 <w:color w:val="2D3748"/>
                 <w:sz w:val="18"/>
               </w:rPr>
-              <w:t>Auto-update target version must strictly match the live backend API response</w:t>
+              <w:t>Auto-update target version and package URLs must strictly match live App Controller API response.</w:t>
             </w:r>
           </w:p>
         </w:tc>
         <w:tc>
           <w:tcPr>
-            <w:tcW w:type="dxa" w:w="3312"/>
+            <w:tcW w:type="dxa" w:w="2592"/>
             <w:shd w:fill="FFFFFF"/>
             <w:tcMar>
-              <w:top w:w="80" w:type="dxa"/>
-              <w:bottom w:w="80" w:type="dxa"/>
-              <w:left w:w="150" w:type="dxa"/>
-              <w:right w:w="150" w:type="dxa"/>
+              <w:top w:w="100" w:type="dxa"/>
+              <w:bottom w:w="100" w:type="dxa"/>
+              <w:left w:w="140" w:type="dxa"/>
+              <w:right w:w="140" w:type="dxa"/>
             </w:tcMar>
           </w:tcPr>
           <w:p>
             <w:pPr>
-              <w:jc w:val="left"/>
+              <w:spacing w:before="0" w:after="0" w:line="276" w:lineRule="auto"/>
             </w:pPr>
             <w:r>
               <w:rPr>
@@ -1280,7 +1383,7 @@
                 <w:color w:val="2D3748"/>
                 <w:sz w:val="18"/>
               </w:rPr>
-              <w:t>Live API integration tests and semantic version precedence unit tests</w:t>
+              <w:t>Live API integration tests, PE/DMG signature validation, and semantic version precedence unit tests.</w:t>
             </w:r>
           </w:p>
         </w:tc>
@@ -1288,22 +1391,23 @@
       <w:tr>
         <w:tc>
           <w:tcPr>
-            <w:tcW w:type="dxa" w:w="1872"/>
+            <w:tcW w:type="dxa" w:w="2160"/>
             <w:shd w:fill="F8FAFC"/>
             <w:tcMar>
-              <w:top w:w="80" w:type="dxa"/>
-              <w:bottom w:w="80" w:type="dxa"/>
-              <w:left w:w="150" w:type="dxa"/>
-              <w:right w:w="150" w:type="dxa"/>
+              <w:top w:w="100" w:type="dxa"/>
+              <w:bottom w:w="100" w:type="dxa"/>
+              <w:left w:w="140" w:type="dxa"/>
+              <w:right w:w="140" w:type="dxa"/>
             </w:tcMar>
           </w:tcPr>
           <w:p>
             <w:pPr>
-              <w:jc w:val="left"/>
+              <w:spacing w:before="0" w:after="0" w:line="276" w:lineRule="auto"/>
             </w:pPr>
             <w:r>
               <w:rPr>
                 <w:rFonts w:ascii="Arial" w:hAnsi="Arial"/>
+                <w:b/>
                 <w:color w:val="2D3748"/>
                 <w:sz w:val="18"/>
               </w:rPr>
@@ -1316,15 +1420,15 @@
             <w:tcW w:type="dxa" w:w="4608"/>
             <w:shd w:fill="F8FAFC"/>
             <w:tcMar>
-              <w:top w:w="80" w:type="dxa"/>
-              <w:bottom w:w="80" w:type="dxa"/>
-              <w:left w:w="150" w:type="dxa"/>
-              <w:right w:w="150" w:type="dxa"/>
+              <w:top w:w="100" w:type="dxa"/>
+              <w:bottom w:w="100" w:type="dxa"/>
+              <w:left w:w="140" w:type="dxa"/>
+              <w:right w:w="140" w:type="dxa"/>
             </w:tcMar>
           </w:tcPr>
           <w:p>
             <w:pPr>
-              <w:jc w:val="left"/>
+              <w:spacing w:before="0" w:after="0" w:line="276" w:lineRule="auto"/>
             </w:pPr>
             <w:r>
               <w:rPr>
@@ -1332,24 +1436,24 @@
                 <w:color w:val="2D3748"/>
                 <w:sz w:val="18"/>
               </w:rPr>
-              <w:t>Full regression test pass rate required prior to release artifact packaging</w:t>
+              <w:t>Full regression test pass rate required prior to release artifact packaging across all functional domains.</w:t>
             </w:r>
           </w:p>
         </w:tc>
         <w:tc>
           <w:tcPr>
-            <w:tcW w:type="dxa" w:w="3312"/>
+            <w:tcW w:type="dxa" w:w="2592"/>
             <w:shd w:fill="F8FAFC"/>
             <w:tcMar>
-              <w:top w:w="80" w:type="dxa"/>
-              <w:bottom w:w="80" w:type="dxa"/>
-              <w:left w:w="150" w:type="dxa"/>
-              <w:right w:w="150" w:type="dxa"/>
+              <w:top w:w="100" w:type="dxa"/>
+              <w:bottom w:w="100" w:type="dxa"/>
+              <w:left w:w="140" w:type="dxa"/>
+              <w:right w:w="140" w:type="dxa"/>
             </w:tcMar>
           </w:tcPr>
           <w:p>
             <w:pPr>
-              <w:jc w:val="left"/>
+              <w:spacing w:before="0" w:after="0" w:line="276" w:lineRule="auto"/>
             </w:pPr>
             <w:r>
               <w:rPr>
@@ -1357,7 +1461,85 @@
                 <w:color w:val="2D3748"/>
                 <w:sz w:val="18"/>
               </w:rPr>
-              <w:t>GitHub Actions CI execution of 295 automated unit and integration tests</w:t>
+              <w:t>GitHub Actions CI execution of 576 automated unit and integration tests (100% pass rate).</w:t>
+            </w:r>
+          </w:p>
+        </w:tc>
+      </w:tr>
+      <w:tr>
+        <w:tc>
+          <w:tcPr>
+            <w:tcW w:type="dxa" w:w="2160"/>
+            <w:shd w:fill="FFFFFF"/>
+            <w:tcMar>
+              <w:top w:w="100" w:type="dxa"/>
+              <w:bottom w:w="100" w:type="dxa"/>
+              <w:left w:w="140" w:type="dxa"/>
+              <w:right w:w="140" w:type="dxa"/>
+            </w:tcMar>
+          </w:tcPr>
+          <w:p>
+            <w:pPr>
+              <w:spacing w:before="0" w:after="0" w:line="276" w:lineRule="auto"/>
+            </w:pPr>
+            <w:r>
+              <w:rPr>
+                <w:rFonts w:ascii="Arial" w:hAnsi="Arial"/>
+                <w:b/>
+                <w:color w:val="2D3748"/>
+                <w:sz w:val="18"/>
+              </w:rPr>
+              <w:t>BRD-05</w:t>
+            </w:r>
+          </w:p>
+        </w:tc>
+        <w:tc>
+          <w:tcPr>
+            <w:tcW w:type="dxa" w:w="4608"/>
+            <w:shd w:fill="FFFFFF"/>
+            <w:tcMar>
+              <w:top w:w="100" w:type="dxa"/>
+              <w:bottom w:w="100" w:type="dxa"/>
+              <w:left w:w="140" w:type="dxa"/>
+              <w:right w:w="140" w:type="dxa"/>
+            </w:tcMar>
+          </w:tcPr>
+          <w:p>
+            <w:pPr>
+              <w:spacing w:before="0" w:after="0" w:line="276" w:lineRule="auto"/>
+            </w:pPr>
+            <w:r>
+              <w:rPr>
+                <w:rFonts w:ascii="Arial" w:hAnsi="Arial"/>
+                <w:color w:val="2D3748"/>
+                <w:sz w:val="18"/>
+              </w:rPr>
+              <w:t>Fresh installations must display blank login inputs and prevent stale company code auto-fill.</w:t>
+            </w:r>
+          </w:p>
+        </w:tc>
+        <w:tc>
+          <w:tcPr>
+            <w:tcW w:type="dxa" w:w="2592"/>
+            <w:shd w:fill="FFFFFF"/>
+            <w:tcMar>
+              <w:top w:w="100" w:type="dxa"/>
+              <w:bottom w:w="100" w:type="dxa"/>
+              <w:left w:w="140" w:type="dxa"/>
+              <w:right w:w="140" w:type="dxa"/>
+            </w:tcMar>
+          </w:tcPr>
+          <w:p>
+            <w:pPr>
+              <w:spacing w:before="0" w:after="0" w:line="276" w:lineRule="auto"/>
+            </w:pPr>
+            <w:r>
+              <w:rPr>
+                <w:rFonts w:ascii="Arial" w:hAnsi="Arial"/>
+                <w:color w:val="2D3748"/>
+                <w:sz w:val="18"/>
+              </w:rPr>
+              <w:t>Automated fresh installation test suite validating SessionStore and LoginWindow isolation.</w:t>
             </w:r>
           </w:p>
         </w:tc>
@@ -1365,12 +1547,12 @@
     </w:tbl>
     <w:p>
       <w:pPr>
-        <w:spacing w:after="160"/>
+        <w:spacing w:after="120"/>
       </w:pPr>
     </w:p>
     <w:sectPr>
       <w:pgSz w:w="12240" w:h="15840"/>
-      <w:pgMar w:top="1152" w:right="1152" w:bottom="1152" w:left="1152" w:header="720" w:footer="720" w:gutter="0"/>
+      <w:pgMar w:top="1440" w:right="1800" w:bottom="1440" w:left="1800" w:header="720" w:footer="720" w:gutter="0"/>
       <w:cols w:space="720"/>
       <w:docGrid w:linePitch="360"/>
     </w:sectPr>

</xml_diff>